<commit_message>
Fix dates in the brochure and invoice
Brochure: the course ran as "2 to 4 September" with no year, which is
ambiguous in print and reads as stale once the month passes. It now shows
"2 - 4 September 2026". The fact strip's four columns were equal width and
the longer date wrapped onto a second line, so Dates gains room from the
three shorter columns.

Invoice: the template hardcoded 2026 in both date placeholders and the
invoice number, so it would have been wrong from January onwards. The
placeholders are now year-neutral: [ DD Month YYYY ] and [ EU-INV-0000 ].

Co-Authored-By: Claude Opus 5 <noreply@anthropic.com>
Claude-Session: https://claude.ai/code/session_018fZwBLEC782t8xqoei3m5q
</commit_message>
<xml_diff>
--- a/docs/easyuphill/EasyUphill-COO-Programme.docx
+++ b/docs/easyuphill/EasyUphill-COO-Programme.docx
@@ -39,10 +39,10 @@
         </w:tblBorders>
       </w:tblPr>
       <w:tblGrid>
-        <w:gridCol w:w="2616"/>
-        <w:gridCol w:w="2616"/>
-        <w:gridCol w:w="2616"/>
-        <w:gridCol w:w="2618"/>
+        <w:gridCol w:w="2300"/>
+        <w:gridCol w:w="3100"/>
+        <w:gridCol w:w="2100"/>
+        <w:gridCol w:w="2966"/>
       </w:tblGrid>
       <w:tr>
         <w:trPr>
@@ -50,7 +50,7 @@
         </w:trPr>
         <w:tc>
           <w:tcPr>
-            <w:tcW w:type="dxa" w:w="2616"/>
+            <w:tcW w:type="dxa" w:w="2300"/>
             <w:tcBorders>
               <w:top w:val="none" w:color="FFFFFF" w:sz="0"/>
               <w:left w:val="single" w:color="FFFFFF" w:sz="8"/>
@@ -77,7 +77,7 @@
         </w:tc>
         <w:tc>
           <w:tcPr>
-            <w:tcW w:type="dxa" w:w="2616"/>
+            <w:tcW w:type="dxa" w:w="3100"/>
             <w:tcBorders>
               <w:top w:val="none" w:color="FFFFFF" w:sz="0"/>
               <w:left w:val="single" w:color="FFFFFF" w:sz="8"/>
@@ -104,7 +104,7 @@
         </w:tc>
         <w:tc>
           <w:tcPr>
-            <w:tcW w:type="dxa" w:w="2616"/>
+            <w:tcW w:type="dxa" w:w="2100"/>
             <w:tcBorders>
               <w:top w:val="none" w:color="FFFFFF" w:sz="0"/>
               <w:left w:val="single" w:color="FFFFFF" w:sz="8"/>
@@ -131,7 +131,7 @@
         </w:tc>
         <w:tc>
           <w:tcPr>
-            <w:tcW w:type="dxa" w:w="2618"/>
+            <w:tcW w:type="dxa" w:w="2966"/>
             <w:tcBorders>
               <w:top w:val="none" w:color="FFFFFF" w:sz="0"/>
               <w:left w:val="single" w:color="FFFFFF" w:sz="8"/>
@@ -160,7 +160,7 @@
       <w:tr>
         <w:tc>
           <w:tcPr>
-            <w:tcW w:type="dxa" w:w="2616"/>
+            <w:tcW w:type="dxa" w:w="2300"/>
             <w:tcBorders>
               <w:top w:val="none" w:color="FFFFFF" w:sz="0"/>
               <w:left w:val="single" w:color="FFFFFF" w:sz="8"/>
@@ -192,7 +192,7 @@
         </w:tc>
         <w:tc>
           <w:tcPr>
-            <w:tcW w:type="dxa" w:w="2616"/>
+            <w:tcW w:type="dxa" w:w="3100"/>
             <w:tcBorders>
               <w:top w:val="none" w:color="FFFFFF" w:sz="0"/>
               <w:left w:val="single" w:color="FFFFFF" w:sz="8"/>
@@ -218,13 +218,13 @@
                 <w:bCs/>
                 <w:color w:val="0C2C5A"/>
               </w:rPr>
-              <w:t xml:space="preserve">2 to 4 September</w:t>
+              <w:t xml:space="preserve">2 – 4 September 2026</w:t>
             </w:r>
           </w:p>
         </w:tc>
         <w:tc>
           <w:tcPr>
-            <w:tcW w:type="dxa" w:w="2616"/>
+            <w:tcW w:type="dxa" w:w="2100"/>
             <w:tcBorders>
               <w:top w:val="none" w:color="FFFFFF" w:sz="0"/>
               <w:left w:val="single" w:color="FFFFFF" w:sz="8"/>
@@ -256,7 +256,7 @@
         </w:tc>
         <w:tc>
           <w:tcPr>
-            <w:tcW w:type="dxa" w:w="2618"/>
+            <w:tcW w:type="dxa" w:w="2966"/>
             <w:tcBorders>
               <w:top w:val="none" w:color="FFFFFF" w:sz="0"/>
               <w:left w:val="single" w:color="FFFFFF" w:sz="8"/>

</xml_diff>

<commit_message>
Add the 2026 intake schedule to the brochure
The brochure advertised a single intake, which reads as a one-off and goes
stale the moment it passes. It now carries every intake for the rest of
2026: eight dates, two a month, running Wednesday to Friday like the
original 2-4 September date.

The schedule clears the public holidays that fall inside a course week —
Heritage Day (24 September) and the Day of Reconciliation (16 December) —
and stops at 2-4 December, before the December shutdown.

Layout: the four-up fact strip carried Dates, which no longer fits one
value, so the constants (Format, Duration, Certificate) collapse into a
single navy bar and the dates get their own four-across grid beneath it.
Who Should Attend runs in like the agenda topics to hold the page count at
two.

Co-Authored-By: Claude Opus 5 <noreply@anthropic.com>
Claude-Session: https://claude.ai/code/session_018fZwBLEC782t8xqoei3m5q
</commit_message>
<xml_diff>
--- a/docs/easyuphill/EasyUphill-COO-Programme.docx
+++ b/docs/easyuphill/EasyUphill-COO-Programme.docx
@@ -39,18 +39,14 @@
         </w:tblBorders>
       </w:tblPr>
       <w:tblGrid>
-        <w:gridCol w:w="2300"/>
-        <w:gridCol w:w="3100"/>
-        <w:gridCol w:w="2100"/>
-        <w:gridCol w:w="2966"/>
+        <w:gridCol w:w="3400"/>
+        <w:gridCol w:w="2700"/>
+        <w:gridCol w:w="4366"/>
       </w:tblGrid>
       <w:tr>
-        <w:trPr>
-          <w:tblHeader/>
-        </w:trPr>
         <w:tc>
           <w:tcPr>
-            <w:tcW w:type="dxa" w:w="2300"/>
+            <w:tcW w:type="dxa" w:w="3400"/>
             <w:tcBorders>
               <w:top w:val="none" w:color="FFFFFF" w:sz="0"/>
               <w:left w:val="single" w:color="FFFFFF" w:sz="8"/>
@@ -59,25 +55,42 @@
             </w:tcBorders>
             <w:shd w:fill="0C2C5A" w:color="auto" w:val="clear"/>
             <w:tcMar>
-              <w:top w:type="dxa" w:w="80"/>
+              <w:top w:type="dxa" w:w="70"/>
               <w:left w:type="dxa" w:w="140"/>
-              <w:bottom w:type="dxa" w:w="80"/>
+              <w:bottom w:type="dxa" w:w="70"/>
               <w:right w:type="dxa" w:w="140"/>
             </w:tcMar>
             <w:vAlign w:val="center"/>
           </w:tcPr>
           <w:p>
             <w:pPr>
-              <w:pStyle w:val="TableHead"/>
+              <w:pStyle w:val="FieldEntry"/>
+              <w:spacing w:after="0" w:before="0"/>
             </w:pPr>
             <w:r>
-              <w:t xml:space="preserve">Format</w:t>
+              <w:rPr>
+                <w:b/>
+                <w:bCs/>
+                <w:color w:val="9DC0F0"/>
+                <w:spacing w:val="30"/>
+                <w:sz w:val="15"/>
+                <w:szCs w:val="15"/>
+              </w:rPr>
+              <w:t xml:space="preserve">FORMAT   </w:t>
+            </w:r>
+            <w:r>
+              <w:rPr>
+                <w:b/>
+                <w:bCs/>
+                <w:color w:val="FFFFFF"/>
+              </w:rPr>
+              <w:t xml:space="preserve">Virtual / Online</w:t>
             </w:r>
           </w:p>
         </w:tc>
         <w:tc>
           <w:tcPr>
-            <w:tcW w:type="dxa" w:w="3100"/>
+            <w:tcW w:type="dxa" w:w="2700"/>
             <w:tcBorders>
               <w:top w:val="none" w:color="FFFFFF" w:sz="0"/>
               <w:left w:val="single" w:color="FFFFFF" w:sz="8"/>
@@ -86,25 +99,42 @@
             </w:tcBorders>
             <w:shd w:fill="0C2C5A" w:color="auto" w:val="clear"/>
             <w:tcMar>
-              <w:top w:type="dxa" w:w="80"/>
+              <w:top w:type="dxa" w:w="70"/>
               <w:left w:type="dxa" w:w="140"/>
-              <w:bottom w:type="dxa" w:w="80"/>
+              <w:bottom w:type="dxa" w:w="70"/>
               <w:right w:type="dxa" w:w="140"/>
             </w:tcMar>
             <w:vAlign w:val="center"/>
           </w:tcPr>
           <w:p>
             <w:pPr>
-              <w:pStyle w:val="TableHead"/>
+              <w:pStyle w:val="FieldEntry"/>
+              <w:spacing w:after="0" w:before="0"/>
             </w:pPr>
             <w:r>
-              <w:t xml:space="preserve">Dates</w:t>
+              <w:rPr>
+                <w:b/>
+                <w:bCs/>
+                <w:color w:val="9DC0F0"/>
+                <w:spacing w:val="30"/>
+                <w:sz w:val="15"/>
+                <w:szCs w:val="15"/>
+              </w:rPr>
+              <w:t xml:space="preserve">DURATION   </w:t>
+            </w:r>
+            <w:r>
+              <w:rPr>
+                <w:b/>
+                <w:bCs/>
+                <w:color w:val="FFFFFF"/>
+              </w:rPr>
+              <w:t xml:space="preserve">3 Days</w:t>
             </w:r>
           </w:p>
         </w:tc>
         <w:tc>
           <w:tcPr>
-            <w:tcW w:type="dxa" w:w="2100"/>
+            <w:tcW w:type="dxa" w:w="4366"/>
             <w:tcBorders>
               <w:top w:val="none" w:color="FFFFFF" w:sz="0"/>
               <w:left w:val="single" w:color="FFFFFF" w:sz="8"/>
@@ -113,58 +143,75 @@
             </w:tcBorders>
             <w:shd w:fill="0C2C5A" w:color="auto" w:val="clear"/>
             <w:tcMar>
-              <w:top w:type="dxa" w:w="80"/>
+              <w:top w:type="dxa" w:w="70"/>
               <w:left w:type="dxa" w:w="140"/>
-              <w:bottom w:type="dxa" w:w="80"/>
+              <w:bottom w:type="dxa" w:w="70"/>
               <w:right w:type="dxa" w:w="140"/>
             </w:tcMar>
             <w:vAlign w:val="center"/>
           </w:tcPr>
           <w:p>
             <w:pPr>
-              <w:pStyle w:val="TableHead"/>
+              <w:pStyle w:val="FieldEntry"/>
+              <w:spacing w:after="0" w:before="0"/>
             </w:pPr>
             <w:r>
-              <w:t xml:space="preserve">Duration</w:t>
+              <w:rPr>
+                <w:b/>
+                <w:bCs/>
+                <w:color w:val="9DC0F0"/>
+                <w:spacing w:val="30"/>
+                <w:sz w:val="15"/>
+                <w:szCs w:val="15"/>
+              </w:rPr>
+              <w:t xml:space="preserve">CERTIFICATE   </w:t>
             </w:r>
-          </w:p>
-        </w:tc>
-        <w:tc>
-          <w:tcPr>
-            <w:tcW w:type="dxa" w:w="2966"/>
-            <w:tcBorders>
-              <w:top w:val="none" w:color="FFFFFF" w:sz="0"/>
-              <w:left w:val="single" w:color="FFFFFF" w:sz="8"/>
-              <w:bottom w:val="none" w:color="FFFFFF" w:sz="0"/>
-              <w:right w:val="single" w:color="FFFFFF" w:sz="8"/>
-            </w:tcBorders>
-            <w:shd w:fill="0C2C5A" w:color="auto" w:val="clear"/>
-            <w:tcMar>
-              <w:top w:type="dxa" w:w="80"/>
-              <w:left w:type="dxa" w:w="140"/>
-              <w:bottom w:type="dxa" w:w="80"/>
-              <w:right w:type="dxa" w:w="140"/>
-            </w:tcMar>
-            <w:vAlign w:val="center"/>
-          </w:tcPr>
-          <w:p>
-            <w:pPr>
-              <w:pStyle w:val="TableHead"/>
-            </w:pPr>
             <w:r>
-              <w:t xml:space="preserve">Certificate</w:t>
+              <w:rPr>
+                <w:b/>
+                <w:bCs/>
+                <w:color w:val="FFFFFF"/>
+              </w:rPr>
+              <w:t xml:space="preserve">On Completion</w:t>
             </w:r>
           </w:p>
         </w:tc>
       </w:tr>
+    </w:tbl>
+    <w:p>
+      <w:pPr>
+        <w:pStyle w:val="Heading1"/>
+      </w:pPr>
+      <w:r>
+        <w:t xml:space="preserve">2026 Intake Dates</w:t>
+      </w:r>
+    </w:p>
+    <w:tbl>
+      <w:tblPr>
+        <w:tblW w:type="dxa" w:w="10466"/>
+        <w:tblBorders>
+          <w:top w:val="single" w:color="auto" w:sz="4"/>
+          <w:left w:val="single" w:color="auto" w:sz="4"/>
+          <w:bottom w:val="single" w:color="auto" w:sz="4"/>
+          <w:right w:val="single" w:color="auto" w:sz="4"/>
+          <w:insideH w:val="single" w:color="auto" w:sz="4"/>
+          <w:insideV w:val="single" w:color="auto" w:sz="4"/>
+        </w:tblBorders>
+      </w:tblPr>
+      <w:tblGrid>
+        <w:gridCol w:w="2616"/>
+        <w:gridCol w:w="2616"/>
+        <w:gridCol w:w="2616"/>
+        <w:gridCol w:w="2618"/>
+      </w:tblGrid>
       <w:tr>
         <w:tc>
           <w:tcPr>
-            <w:tcW w:type="dxa" w:w="2300"/>
+            <w:tcW w:type="dxa" w:w="2616"/>
             <w:tcBorders>
-              <w:top w:val="none" w:color="FFFFFF" w:sz="0"/>
+              <w:top w:val="single" w:color="FFFFFF" w:sz="8"/>
               <w:left w:val="single" w:color="FFFFFF" w:sz="8"/>
-              <w:bottom w:val="none" w:color="FFFFFF" w:sz="0"/>
+              <w:bottom w:val="single" w:color="FFFFFF" w:sz="8"/>
               <w:right w:val="single" w:color="FFFFFF" w:sz="8"/>
             </w:tcBorders>
             <w:shd w:fill="F3F6FB" w:color="auto" w:val="clear"/>
@@ -179,6 +226,8 @@
           <w:p>
             <w:pPr>
               <w:pStyle w:val="FieldEntry"/>
+              <w:spacing w:after="0" w:before="0"/>
+              <w:jc w:val="center"/>
             </w:pPr>
             <w:r>
               <w:rPr>
@@ -186,17 +235,17 @@
                 <w:bCs/>
                 <w:color w:val="0C2C5A"/>
               </w:rPr>
-              <w:t xml:space="preserve">Virtual / Online</w:t>
+              <w:t xml:space="preserve">26 – 28 August</w:t>
             </w:r>
           </w:p>
         </w:tc>
         <w:tc>
           <w:tcPr>
-            <w:tcW w:type="dxa" w:w="3100"/>
+            <w:tcW w:type="dxa" w:w="2616"/>
             <w:tcBorders>
-              <w:top w:val="none" w:color="FFFFFF" w:sz="0"/>
+              <w:top w:val="single" w:color="FFFFFF" w:sz="8"/>
               <w:left w:val="single" w:color="FFFFFF" w:sz="8"/>
-              <w:bottom w:val="none" w:color="FFFFFF" w:sz="0"/>
+              <w:bottom w:val="single" w:color="FFFFFF" w:sz="8"/>
               <w:right w:val="single" w:color="FFFFFF" w:sz="8"/>
             </w:tcBorders>
             <w:shd w:fill="F3F6FB" w:color="auto" w:val="clear"/>
@@ -211,6 +260,8 @@
           <w:p>
             <w:pPr>
               <w:pStyle w:val="FieldEntry"/>
+              <w:spacing w:after="0" w:before="0"/>
+              <w:jc w:val="center"/>
             </w:pPr>
             <w:r>
               <w:rPr>
@@ -218,17 +269,17 @@
                 <w:bCs/>
                 <w:color w:val="0C2C5A"/>
               </w:rPr>
-              <w:t xml:space="preserve">2 – 4 September 2026</w:t>
+              <w:t xml:space="preserve">2 – 4 September</w:t>
             </w:r>
           </w:p>
         </w:tc>
         <w:tc>
           <w:tcPr>
-            <w:tcW w:type="dxa" w:w="2100"/>
+            <w:tcW w:type="dxa" w:w="2616"/>
             <w:tcBorders>
-              <w:top w:val="none" w:color="FFFFFF" w:sz="0"/>
+              <w:top w:val="single" w:color="FFFFFF" w:sz="8"/>
               <w:left w:val="single" w:color="FFFFFF" w:sz="8"/>
-              <w:bottom w:val="none" w:color="FFFFFF" w:sz="0"/>
+              <w:bottom w:val="single" w:color="FFFFFF" w:sz="8"/>
               <w:right w:val="single" w:color="FFFFFF" w:sz="8"/>
             </w:tcBorders>
             <w:shd w:fill="F3F6FB" w:color="auto" w:val="clear"/>
@@ -243,6 +294,8 @@
           <w:p>
             <w:pPr>
               <w:pStyle w:val="FieldEntry"/>
+              <w:spacing w:after="0" w:before="0"/>
+              <w:jc w:val="center"/>
             </w:pPr>
             <w:r>
               <w:rPr>
@@ -250,17 +303,17 @@
                 <w:bCs/>
                 <w:color w:val="0C2C5A"/>
               </w:rPr>
-              <w:t xml:space="preserve">3 Days</w:t>
+              <w:t xml:space="preserve">16 – 18 September</w:t>
             </w:r>
           </w:p>
         </w:tc>
         <w:tc>
           <w:tcPr>
-            <w:tcW w:type="dxa" w:w="2966"/>
+            <w:tcW w:type="dxa" w:w="2618"/>
             <w:tcBorders>
-              <w:top w:val="none" w:color="FFFFFF" w:sz="0"/>
+              <w:top w:val="single" w:color="FFFFFF" w:sz="8"/>
               <w:left w:val="single" w:color="FFFFFF" w:sz="8"/>
-              <w:bottom w:val="none" w:color="FFFFFF" w:sz="0"/>
+              <w:bottom w:val="single" w:color="FFFFFF" w:sz="8"/>
               <w:right w:val="single" w:color="FFFFFF" w:sz="8"/>
             </w:tcBorders>
             <w:shd w:fill="F3F6FB" w:color="auto" w:val="clear"/>
@@ -275,6 +328,8 @@
           <w:p>
             <w:pPr>
               <w:pStyle w:val="FieldEntry"/>
+              <w:spacing w:after="0" w:before="0"/>
+              <w:jc w:val="center"/>
             </w:pPr>
             <w:r>
               <w:rPr>
@@ -282,7 +337,145 @@
                 <w:bCs/>
                 <w:color w:val="0C2C5A"/>
               </w:rPr>
-              <w:t xml:space="preserve">On Completion</w:t>
+              <w:t xml:space="preserve">7 – 9 October</w:t>
+            </w:r>
+          </w:p>
+        </w:tc>
+      </w:tr>
+      <w:tr>
+        <w:tc>
+          <w:tcPr>
+            <w:tcW w:type="dxa" w:w="2616"/>
+            <w:tcBorders>
+              <w:top w:val="single" w:color="FFFFFF" w:sz="8"/>
+              <w:left w:val="single" w:color="FFFFFF" w:sz="8"/>
+              <w:bottom w:val="single" w:color="FFFFFF" w:sz="8"/>
+              <w:right w:val="single" w:color="FFFFFF" w:sz="8"/>
+            </w:tcBorders>
+            <w:shd w:fill="F3F6FB" w:color="auto" w:val="clear"/>
+            <w:tcMar>
+              <w:top w:type="dxa" w:w="80"/>
+              <w:left w:type="dxa" w:w="140"/>
+              <w:bottom w:type="dxa" w:w="80"/>
+              <w:right w:type="dxa" w:w="140"/>
+            </w:tcMar>
+            <w:vAlign w:val="center"/>
+          </w:tcPr>
+          <w:p>
+            <w:pPr>
+              <w:pStyle w:val="FieldEntry"/>
+              <w:spacing w:after="0" w:before="0"/>
+              <w:jc w:val="center"/>
+            </w:pPr>
+            <w:r>
+              <w:rPr>
+                <w:b/>
+                <w:bCs/>
+                <w:color w:val="0C2C5A"/>
+              </w:rPr>
+              <w:t xml:space="preserve">21 – 23 October</w:t>
+            </w:r>
+          </w:p>
+        </w:tc>
+        <w:tc>
+          <w:tcPr>
+            <w:tcW w:type="dxa" w:w="2616"/>
+            <w:tcBorders>
+              <w:top w:val="single" w:color="FFFFFF" w:sz="8"/>
+              <w:left w:val="single" w:color="FFFFFF" w:sz="8"/>
+              <w:bottom w:val="single" w:color="FFFFFF" w:sz="8"/>
+              <w:right w:val="single" w:color="FFFFFF" w:sz="8"/>
+            </w:tcBorders>
+            <w:shd w:fill="F3F6FB" w:color="auto" w:val="clear"/>
+            <w:tcMar>
+              <w:top w:type="dxa" w:w="80"/>
+              <w:left w:type="dxa" w:w="140"/>
+              <w:bottom w:type="dxa" w:w="80"/>
+              <w:right w:type="dxa" w:w="140"/>
+            </w:tcMar>
+            <w:vAlign w:val="center"/>
+          </w:tcPr>
+          <w:p>
+            <w:pPr>
+              <w:pStyle w:val="FieldEntry"/>
+              <w:spacing w:after="0" w:before="0"/>
+              <w:jc w:val="center"/>
+            </w:pPr>
+            <w:r>
+              <w:rPr>
+                <w:b/>
+                <w:bCs/>
+                <w:color w:val="0C2C5A"/>
+              </w:rPr>
+              <w:t xml:space="preserve">4 – 6 November</w:t>
+            </w:r>
+          </w:p>
+        </w:tc>
+        <w:tc>
+          <w:tcPr>
+            <w:tcW w:type="dxa" w:w="2616"/>
+            <w:tcBorders>
+              <w:top w:val="single" w:color="FFFFFF" w:sz="8"/>
+              <w:left w:val="single" w:color="FFFFFF" w:sz="8"/>
+              <w:bottom w:val="single" w:color="FFFFFF" w:sz="8"/>
+              <w:right w:val="single" w:color="FFFFFF" w:sz="8"/>
+            </w:tcBorders>
+            <w:shd w:fill="F3F6FB" w:color="auto" w:val="clear"/>
+            <w:tcMar>
+              <w:top w:type="dxa" w:w="80"/>
+              <w:left w:type="dxa" w:w="140"/>
+              <w:bottom w:type="dxa" w:w="80"/>
+              <w:right w:type="dxa" w:w="140"/>
+            </w:tcMar>
+            <w:vAlign w:val="center"/>
+          </w:tcPr>
+          <w:p>
+            <w:pPr>
+              <w:pStyle w:val="FieldEntry"/>
+              <w:spacing w:after="0" w:before="0"/>
+              <w:jc w:val="center"/>
+            </w:pPr>
+            <w:r>
+              <w:rPr>
+                <w:b/>
+                <w:bCs/>
+                <w:color w:val="0C2C5A"/>
+              </w:rPr>
+              <w:t xml:space="preserve">18 – 20 November</w:t>
+            </w:r>
+          </w:p>
+        </w:tc>
+        <w:tc>
+          <w:tcPr>
+            <w:tcW w:type="dxa" w:w="2618"/>
+            <w:tcBorders>
+              <w:top w:val="single" w:color="FFFFFF" w:sz="8"/>
+              <w:left w:val="single" w:color="FFFFFF" w:sz="8"/>
+              <w:bottom w:val="single" w:color="FFFFFF" w:sz="8"/>
+              <w:right w:val="single" w:color="FFFFFF" w:sz="8"/>
+            </w:tcBorders>
+            <w:shd w:fill="F3F6FB" w:color="auto" w:val="clear"/>
+            <w:tcMar>
+              <w:top w:type="dxa" w:w="80"/>
+              <w:left w:type="dxa" w:w="140"/>
+              <w:bottom w:type="dxa" w:w="80"/>
+              <w:right w:type="dxa" w:w="140"/>
+            </w:tcMar>
+            <w:vAlign w:val="center"/>
+          </w:tcPr>
+          <w:p>
+            <w:pPr>
+              <w:pStyle w:val="FieldEntry"/>
+              <w:spacing w:after="0" w:before="0"/>
+              <w:jc w:val="center"/>
+            </w:pPr>
+            <w:r>
+              <w:rPr>
+                <w:b/>
+                <w:bCs/>
+                <w:color w:val="0C2C5A"/>
+              </w:rPr>
+              <w:t xml:space="preserve">2 – 4 December</w:t>
             </w:r>
           </w:p>
         </w:tc>
@@ -290,8 +483,12 @@
     </w:tbl>
     <w:p>
       <w:pPr>
-        <w:spacing w:after="0"/>
-      </w:pPr>
+        <w:pStyle w:val="Meta"/>
+        <w:spacing w:after="0" w:before="90"/>
+      </w:pPr>
+      <w:r>
+        <w:t xml:space="preserve">All intakes run Wednesday to Friday.</w:t>
+      </w:r>
     </w:p>
     <w:p>
       <w:pPr>
@@ -459,60 +656,44 @@
     </w:p>
     <w:p>
       <w:pPr>
-        <w:pStyle w:val="ListParagraph"/>
-        <w:numPr>
-          <w:ilvl w:val="0"/>
-          <w:numId w:val="2"/>
-        </w:numPr>
+        <w:pStyle w:val="Topics"/>
       </w:pPr>
       <w:r>
         <w:t xml:space="preserve">Existing and aspiring Chief Operating Officers</w:t>
       </w:r>
-    </w:p>
-    <w:p>
-      <w:pPr>
-        <w:pStyle w:val="ListParagraph"/>
-        <w:numPr>
-          <w:ilvl w:val="0"/>
-          <w:numId w:val="2"/>
-        </w:numPr>
-      </w:pPr>
+      <w:r>
+        <w:rPr>
+          <w:rStyle w:val="Separator"/>
+        </w:rPr>
+        <w:t xml:space="preserve">  ·  </w:t>
+      </w:r>
       <w:r>
         <w:t xml:space="preserve">Heads of Operations</w:t>
       </w:r>
-    </w:p>
-    <w:p>
-      <w:pPr>
-        <w:pStyle w:val="ListParagraph"/>
-        <w:numPr>
-          <w:ilvl w:val="0"/>
-          <w:numId w:val="2"/>
-        </w:numPr>
-      </w:pPr>
+      <w:r>
+        <w:rPr>
+          <w:rStyle w:val="Separator"/>
+        </w:rPr>
+        <w:t xml:space="preserve">  ·  </w:t>
+      </w:r>
       <w:r>
         <w:t xml:space="preserve">Risk Managers and Risk Directors</w:t>
       </w:r>
-    </w:p>
-    <w:p>
-      <w:pPr>
-        <w:pStyle w:val="ListParagraph"/>
-        <w:numPr>
-          <w:ilvl w:val="0"/>
-          <w:numId w:val="2"/>
-        </w:numPr>
-      </w:pPr>
+      <w:r>
+        <w:rPr>
+          <w:rStyle w:val="Separator"/>
+        </w:rPr>
+        <w:t xml:space="preserve">  ·  </w:t>
+      </w:r>
       <w:r>
         <w:t xml:space="preserve">Control Function Managers</w:t>
       </w:r>
-    </w:p>
-    <w:p>
-      <w:pPr>
-        <w:pStyle w:val="ListParagraph"/>
-        <w:numPr>
-          <w:ilvl w:val="0"/>
-          <w:numId w:val="2"/>
-        </w:numPr>
-      </w:pPr>
+      <w:r>
+        <w:rPr>
+          <w:rStyle w:val="Separator"/>
+        </w:rPr>
+        <w:t xml:space="preserve">  ·  </w:t>
+      </w:r>
       <w:r>
         <w:t xml:space="preserve">Senior Executives preparing for broader leadership responsibilities</w:t>
       </w:r>

</xml_diff>

<commit_message>
Hold the brochure calendar to a 14-day booking lead
The first session was 31 August, seven days out. Fixing the BMC generator
established that a published date needs at least fourteen days' notice to
be bookable, and the brochure was breaking its own rule.

The calendar now starts 7 September and stays fortnightly, Monday to
Wednesday, clear of Heritage Day and the Day of Reconciliation. Eight
sessions, unchanged in count.

Co-Authored-By: Claude Opus 5 <noreply@anthropic.com>
Claude-Session: https://claude.ai/code/session_018fZwBLEC782t8xqoei3m5q
</commit_message>
<xml_diff>
--- a/docs/easyuphill/EasyUphill-COO-Programme.docx
+++ b/docs/easyuphill/EasyUphill-COO-Programme.docx
@@ -174,7 +174,7 @@
                 <w:bCs/>
                 <w:color w:val="0C2C5A"/>
               </w:rPr>
-              <w:t xml:space="preserve">31 August to 2 September 2026</w:t>
+              <w:t xml:space="preserve">7 to 9 September 2026</w:t>
             </w:r>
           </w:p>
         </w:tc>
@@ -278,7 +278,7 @@
                 <w:bCs/>
                 <w:color w:val="0C2C5A"/>
               </w:rPr>
-              <w:t xml:space="preserve">14 to 16 September 2026</w:t>
+              <w:t xml:space="preserve">21 to 23 September 2026</w:t>
             </w:r>
           </w:p>
         </w:tc>
@@ -382,7 +382,7 @@
                 <w:bCs/>
                 <w:color w:val="0C2C5A"/>
               </w:rPr>
-              <w:t xml:space="preserve">28 to 30 September 2026</w:t>
+              <w:t xml:space="preserve">5 to 7 October 2026</w:t>
             </w:r>
           </w:p>
         </w:tc>
@@ -486,7 +486,7 @@
                 <w:bCs/>
                 <w:color w:val="0C2C5A"/>
               </w:rPr>
-              <w:t xml:space="preserve">12 to 14 October 2026</w:t>
+              <w:t xml:space="preserve">19 to 21 October 2026</w:t>
             </w:r>
           </w:p>
         </w:tc>
@@ -590,7 +590,7 @@
                 <w:bCs/>
                 <w:color w:val="0C2C5A"/>
               </w:rPr>
-              <w:t xml:space="preserve">26 to 28 October 2026</w:t>
+              <w:t xml:space="preserve">2 to 4 November 2026</w:t>
             </w:r>
           </w:p>
         </w:tc>
@@ -694,7 +694,7 @@
                 <w:bCs/>
                 <w:color w:val="0C2C5A"/>
               </w:rPr>
-              <w:t xml:space="preserve">9 to 11 November 2026</w:t>
+              <w:t xml:space="preserve">16 to 18 November 2026</w:t>
             </w:r>
           </w:p>
         </w:tc>
@@ -798,7 +798,7 @@
                 <w:bCs/>
                 <w:color w:val="0C2C5A"/>
               </w:rPr>
-              <w:t xml:space="preserve">23 to 25 November 2026</w:t>
+              <w:t xml:space="preserve">30 November to 2 December 2026</w:t>
             </w:r>
           </w:p>
         </w:tc>

</xml_diff>